<commit_message>
Update weekly report: ventilation fan and gas work completed
Co-Authored-By: Claude Sonnet 5.5 <noreply@anthropic.com>
Claude-Session: https://claude.ai/code/session_01DphKwVid4hU3rNZvpSscPz
</commit_message>
<xml_diff>
--- a/業務処理状況報告書_フジタ津田沼マンション_送付状付き_20261019.docx
+++ b/業務処理状況報告書_フジタ津田沼マンション_送付状付き_20261019.docx
@@ -114,7 +114,7 @@
           <w:sz w:val="21"/>
           <w:szCs w:val="21"/>
         </w:rPr>
-        <w:t xml:space="preserve">このたびは、床の張替えに続き、換気扇・ガス設備の交換にもご尽力いただき、誠にありがとうございます。</w:t>
+        <w:t xml:space="preserve">このたびは、床の張替えに続き、換気扇・ガス設備の交換も完了いただき、誠にありがとうございました。</w:t>
       </w:r>
     </w:p>
     <w:p>
@@ -162,7 +162,7 @@
           <w:sz w:val="21"/>
           <w:szCs w:val="21"/>
         </w:rPr>
-        <w:t xml:space="preserve">なお、換気扇・ガスの工事が完了しましたら、日付をお知らせいただけますと幸いです。チラシの記載を「交換済」に更新してまいります。</w:t>
+        <w:t xml:space="preserve">なお、工事後の写真も撮影いたしました。チラシおよび各広告媒体の記載を「交換済」に更新してまいります。</w:t>
       </w:r>
     </w:p>
     <w:p>
@@ -589,7 +589,7 @@
           <w:sz w:val="19"/>
           <w:szCs w:val="19"/>
         </w:rPr>
-        <w:t xml:space="preserve">このたびは、洋室・LDK・廊下の床張替えに続き、キッチン換気扇・ガス設備の交換（10月中旬予定）にもご尽力いただき、誠にありがとうございます。お手配からご負担まで、心より御礼申し上げます。</w:t>
+        <w:t xml:space="preserve">このたびは、洋室・LDK・廊下の床張替えに続き、キッチン換気扇・ガス設備の交換も完了いただき、誠にありがとうございました。お手配からご負担まで、心より御礼申し上げます。</w:t>
       </w:r>
     </w:p>
     <w:p>
@@ -605,7 +605,7 @@
           <w:sz w:val="19"/>
           <w:szCs w:val="19"/>
         </w:rPr>
-        <w:t xml:space="preserve">工事が完了いたしましたら、お手数ですが日付をお知らせいただけますと幸いです。チラシおよび各広告媒体の表示を「交換済」に更新してまいります。</w:t>
+        <w:t xml:space="preserve">工事後の室内・設備の写真も撮影いたしました。チラシおよび各広告媒体の表示を「交換済」に更新してまいります。</w:t>
       </w:r>
     </w:p>
     <w:p>
@@ -725,7 +725,7 @@
                 <w:sz w:val="18"/>
                 <w:szCs w:val="18"/>
               </w:rPr>
-              <w:t xml:space="preserve">換気扇・ガス設備交換（10月中旬予定）もあわせてご案内</w:t>
+              <w:t xml:space="preserve">換気扇・ガス設備の交換済みもあわせてご案内</w:t>
             </w:r>
           </w:p>
         </w:tc>
@@ -797,7 +797,7 @@
                 <w:sz w:val="18"/>
                 <w:szCs w:val="18"/>
               </w:rPr>
-              <w:t xml:space="preserve">2回目：1,500枚（換気扇・ガス設備の工事完了後、「交換済」に更新した版で配布）</w:t>
+              <w:t xml:space="preserve">2回目：1,500枚（別のエリアへ配布）</w:t>
             </w:r>
           </w:p>
         </w:tc>
@@ -855,7 +855,7 @@
           <w:sz w:val="19"/>
           <w:szCs w:val="19"/>
         </w:rPr>
-        <w:t xml:space="preserve">チラシ配布後の反響は、次回以降のご報告にて速やかにお知らせいたします。換気扇・ガス設備の工事が完了いたしましたら、販売図面および各広告媒体の表示を「交換済」に更新し、あらためて訴求してまいります。</w:t>
+        <w:t xml:space="preserve">チラシ配布後の反響は、次回以降のご報告にて速やかにお知らせいたします。換気扇・ガス設備の工事完了を受け、販売図面および各広告媒体の表示を「交換済」に更新し、あらためて訴求してまいります。</w:t>
       </w:r>
     </w:p>
     <w:p>

</xml_diff>